<commit_message>
chore: update document attachments for various templates
</commit_message>
<xml_diff>
--- a/public/templates/pricetag/disc-kcl-per-100gr.docx
+++ b/public/templates/pricetag/disc-kcl-per-100gr.docx
@@ -169,7 +169,7 @@
         <w:pict>
           <v:shape id="_x0000_s1036" type="#_x0000_t136" style="position:absolute;margin-left:113.25pt;margin-top:99pt;width:75.75pt;height:9pt;z-index:251668480;mso-position-horizontal-relative:text;mso-position-vertical-relative:text" fillcolor="black" strokeweight="1.5pt">
             <v:shadow color="#868686"/>
-            <v:textpath style="font-family:&quot;Malgun Gothic&quot;;font-size:18pt;font-weight:bold;v-text-kern:t" trim="t" fitpath="t" string="Akhir Periode"/>
+            <v:textpath style="font-family:&quot;Arial Black&quot;;Malgun Gothic&quot;;font-size:18pt;font-weight:bold;v-text-kern:t" trim="t" fitpath="t" string="Akhir Periode"/>
           </v:shape>
         </w:pict>
       </w:r>
@@ -181,7 +181,7 @@
         <w:pict>
           <v:shape id="_x0000_s1035" type="#_x0000_t136" style="position:absolute;margin-left:109.2pt;margin-top:117pt;width:96.75pt;height:9pt;z-index:251667456;mso-position-horizontal-relative:text;mso-position-vertical-relative:text" fillcolor="black" strokeweight="1.5pt">
             <v:shadow color="#868686"/>
-            <v:textpath style="font-family:&quot;Arial Unicode MS&quot;;font-size:18pt;font-weight:bold;v-text-kern:t" trim="t" fitpath="t" string="&lt;&lt;Periode&gt;&gt;"/>
+            <v:textpath style="font-family:&quot;Arial Black&quot;;Arial Unicode MS&quot;;font-size:18pt;font-weight:bold;v-text-kern:t" trim="t" fitpath="t" string="&lt;&lt;Periode&gt;&gt;"/>
             <w10:wrap type="square"/>
           </v:shape>
         </w:pict>

</xml_diff>